<commit_message>
Expand Q3 content: fuller detail, add 3 previously-researched items, no more length cap
Per instruction: don't artificially shorten news. Removed the 2-4 sentence
cap from RESEARCH_AGENT_PROMPT.md — length should track how much the
source actually supports, in both directions (no padding either). Added
3 genuine, already-researched items that had been left out during earlier
condensing: Muni Samvegaratna Sagar's Chaturmas pravesh (Raipur, Jul22),
the ₹53 crore ceremonial kalash bidding (Indore, Jul30), and the Chitrakoot
Mangal Milan ahimsa gathering (Jul13). Expanded the Terapanth Foundation
Day item with the Sadhvi Lakshyaprabha detail. 23 -> 26 items total.

Co-Authored-By: Claude Sonnet 5 <noreply@anthropic.com>
Claude-Session: https://claude.ai/code/session_01FU2eXb1yBzQGtYCFiFpbPt
</commit_message>
<xml_diff>
--- a/automation/issues/JainMagazine_Q3_2026_todate.docx
+++ b/automation/issues/JainMagazine_Q3_2026_todate.docx
@@ -144,7 +144,7 @@
         </w:rPr>
         <w:t xml:space="preserve">  →  </w:t>
       </w:r>
-      <w:hyperlink w:history="1" r:id="rIddffmdsadhwvgyxtx03e7d">
+      <w:hyperlink w:history="1" r:id="rIdnwelxekn9nldmtxxk3kiu">
         <w:r>
           <w:rPr>
             <w:rFonts w:ascii="Arial" w:cs="Arial" w:eastAsia="Arial" w:hAnsi="Arial"/>
@@ -170,7 +170,7 @@
           <w:sz w:val="21"/>
           <w:szCs w:val="21"/>
         </w:rPr>
-        <w:t xml:space="preserve">The Jain Śvetāmbara Terapanth Dharmasangh observed its 267th Foundation Day on Ashadhi Purnima, presided over by its 11th Acharya, Mahashraman — his first major discourse of this year's Chaturmas. Themed "Terapanth Will Endure Forever," the occasion was simultaneously marked at Terapanth centers nationwide.</w:t>
+        <w:t xml:space="preserve">The Jain Śvetāmbara Terapanth Dharmasangh observed its 267th Foundation Day on Ashadhi Purnima, presided over by its 11th Acharya, Mahashraman — his first major discourse of this year's Chaturmas. Themed "Terapanth Will Endure Forever," the occasion was simultaneously marked at Terapanth centers nationwide, including at Sri Dungargarh, where senior sadhvi Lakshyaprabha addressed a separate gathering on the theme of self-awakening and the order's founding ideals — a reminder that the observance reached beyond Ladnun into the wider Terapanth monastic and lay community on the same day.</w:t>
       </w:r>
     </w:p>
     <w:p>
@@ -240,7 +240,7 @@
         </w:rPr>
         <w:t xml:space="preserve">  →  </w:t>
       </w:r>
-      <w:hyperlink w:history="1" r:id="rId4dn4iox1cv10goab5woe8">
+      <w:hyperlink w:history="1" r:id="rIdogm6pj93kkmtzrgfcqfhi">
         <w:r>
           <w:rPr>
             <w:rFonts w:ascii="Arial" w:cs="Arial" w:eastAsia="Arial" w:hAnsi="Arial"/>
@@ -336,7 +336,7 @@
         </w:rPr>
         <w:t xml:space="preserve">  →  </w:t>
       </w:r>
-      <w:hyperlink w:history="1" r:id="rIdufgrf4nh__1t3gkdaaheg">
+      <w:hyperlink w:history="1" r:id="rIdknh77_ed00cel3sl26vrl">
         <w:r>
           <w:rPr>
             <w:rFonts w:ascii="Arial" w:cs="Arial" w:eastAsia="Arial" w:hAnsi="Arial"/>
@@ -557,7 +557,7 @@
         </w:rPr>
         <w:t xml:space="preserve">  →  </w:t>
       </w:r>
-      <w:hyperlink w:history="1" r:id="rIdfnkrxisfjqhmbtsvvnle_">
+      <w:hyperlink w:history="1" r:id="rId-qe1x2ea4ziousjscaweq">
         <w:r>
           <w:rPr>
             <w:rFonts w:ascii="Arial" w:cs="Arial" w:eastAsia="Arial" w:hAnsi="Arial"/>
@@ -636,7 +636,7 @@
         </w:rPr>
         <w:t xml:space="preserve">  →  </w:t>
       </w:r>
-      <w:hyperlink w:history="1" r:id="rIdoqkaaqlb9mu6uft3x4fyp">
+      <w:hyperlink w:history="1" r:id="rIdjhan70_79atdip-gygp5v">
         <w:r>
           <w:rPr>
             <w:rFonts w:ascii="Arial" w:cs="Arial" w:eastAsia="Arial" w:hAnsi="Arial"/>
@@ -703,7 +703,7 @@
           <w:sz w:val="25"/>
           <w:szCs w:val="25"/>
         </w:rPr>
-        <w:t xml:space="preserve">Muni Aagam Sagar Ji's Mangal Pravesh Marks Bada Mandir's First Chaturmas in 18 Years</w:t>
+        <w:t xml:space="preserve">Muni Samvegaratna Sagar Ji's Chaturmas Mangal Pravesh With Shobhayatra</w:t>
       </w:r>
     </w:p>
     <w:p>
@@ -719,7 +719,7 @@
           <w:sz w:val="17"/>
           <w:szCs w:val="17"/>
         </w:rPr>
-        <w:t xml:space="preserve">RAIPUR, CHHATTISGARH · SOURCE: HARIBHOOMI · JUL 19, 2026</w:t>
+        <w:t xml:space="preserve">RAIPUR, CHHATTISGARH · SOURCE: ASR24 NEWS · JUL 22, 2026</w:t>
       </w:r>
       <w:r>
         <w:rPr>
@@ -732,7 +732,7 @@
         </w:rPr>
         <w:t xml:space="preserve">  →  </w:t>
       </w:r>
-      <w:hyperlink w:history="1" r:id="rIdkhonkccsyzdxjuwwfz6j4">
+      <w:hyperlink w:history="1" r:id="rIdbw0nlheuomuf0f6mwo1g1">
         <w:r>
           <w:rPr>
             <w:rFonts w:ascii="Arial" w:cs="Arial" w:eastAsia="Arial" w:hAnsi="Arial"/>
@@ -758,7 +758,7 @@
           <w:sz w:val="21"/>
           <w:szCs w:val="21"/>
         </w:rPr>
-        <w:t xml:space="preserve">Muni 108 Shri Aagam Sagar Ji Maharaj entered Raipur's historic Shri Digambar Jain Bada Mandir — the temple's first Chaturmas hosting in 18 years, drawing large community turnout.</w:t>
+        <w:t xml:space="preserve">The Sri Jain Shvetambar Murtipoojak Sangh organized a procession (shobhayatra) from Sri Rishabdev Temple to Sri Gnanvallabh Upashraya in Vivekanand Nagar, welcoming Muni Samvegaratna Sagar Ji and his monastic group for their Chaturmas stay with chants, kalash, and dharma flags carried through the streets.</w:t>
       </w:r>
     </w:p>
     <w:p>
@@ -782,7 +782,7 @@
           <w:sz w:val="25"/>
           <w:szCs w:val="25"/>
         </w:rPr>
-        <w:t xml:space="preserve">Gurudev Rameshmuniji Arrives in Mysuru After ~90,000-km Padayatra</w:t>
+        <w:t xml:space="preserve">Muni Aagam Sagar Ji's Mangal Pravesh Marks Bada Mandir's First Chaturmas in 18 Years</w:t>
       </w:r>
     </w:p>
     <w:p>
@@ -798,7 +798,7 @@
           <w:sz w:val="17"/>
           <w:szCs w:val="17"/>
         </w:rPr>
-        <w:t xml:space="preserve">MYSURU, KARNATAKA · SOURCE: STAR OF MYSORE · JUL 24, 2026</w:t>
+        <w:t xml:space="preserve">RAIPUR, CHHATTISGARH · SOURCE: HARIBHOOMI · JUL 19, 2026</w:t>
       </w:r>
       <w:r>
         <w:rPr>
@@ -811,7 +811,7 @@
         </w:rPr>
         <w:t xml:space="preserve">  →  </w:t>
       </w:r>
-      <w:hyperlink w:history="1" r:id="rId395mfd3kxcp63t0irrk7u">
+      <w:hyperlink w:history="1" r:id="rIdtxpi1hugf0m36abohjg01">
         <w:r>
           <w:rPr>
             <w:rFonts w:ascii="Arial" w:cs="Arial" w:eastAsia="Arial" w:hAnsi="Arial"/>
@@ -837,7 +837,7 @@
           <w:sz w:val="21"/>
           <w:szCs w:val="21"/>
         </w:rPr>
-        <w:t xml:space="preserve">Gurudev Shri Rameshmuniji Maharaj Saheb, National Minister of the Shraman Sangh, began his Chaturmas stay at Shri Sthanakvasi Jain Sangh, Mahaveernagar, following a decades-spanning foot pilgrimage across India and Nepal.</w:t>
+        <w:t xml:space="preserve">Muni 108 Shri Aagam Sagar Ji Maharaj entered Raipur's historic Shri Digambar Jain Bada Mandir — the temple's first Chaturmas hosting in 18 years, drawing large community turnout.</w:t>
       </w:r>
     </w:p>
     <w:p>
@@ -861,7 +861,7 @@
           <w:sz w:val="25"/>
           <w:szCs w:val="25"/>
         </w:rPr>
-        <w:t xml:space="preserve">Muni Sudhasagar Ji Maharaj Addresses Jain Youth During Indore Chaturmas</w:t>
+        <w:t xml:space="preserve">Gurudev Rameshmuniji Arrives in Mysuru After ~90,000-km Padayatra</w:t>
       </w:r>
     </w:p>
     <w:p>
@@ -877,7 +877,7 @@
           <w:sz w:val="17"/>
           <w:szCs w:val="17"/>
         </w:rPr>
-        <w:t xml:space="preserve">INDORE, MADHYA PRADESH · SOURCE: PALIWALWANI · AUG 9, 2026</w:t>
+        <w:t xml:space="preserve">MYSURU, KARNATAKA · SOURCE: STAR OF MYSORE · JUL 24, 2026</w:t>
       </w:r>
       <w:r>
         <w:rPr>
@@ -890,7 +890,7 @@
         </w:rPr>
         <w:t xml:space="preserve">  →  </w:t>
       </w:r>
-      <w:hyperlink w:history="1" r:id="rIdk4-_3imzbwj8byeofsfpf">
+      <w:hyperlink w:history="1" r:id="rIddkgjurgrheas1ygu9_q_e">
         <w:r>
           <w:rPr>
             <w:rFonts w:ascii="Arial" w:cs="Arial" w:eastAsia="Arial" w:hAnsi="Arial"/>
@@ -916,7 +916,7 @@
           <w:sz w:val="21"/>
           <w:szCs w:val="21"/>
         </w:rPr>
-        <w:t xml:space="preserve">Muni Sudhasagar Ji Maharaj, in Indore for Chaturmas since July 26, delivered a special guidance address to Jain youth at Rishabh Sabha Hall, Adinath Jinalaya.</w:t>
+        <w:t xml:space="preserve">Gurudev Shri Rameshmuniji Maharaj Saheb, National Minister of the Shraman Sangh, began his Chaturmas stay at Shri Sthanakvasi Jain Sangh, Mahaveernagar, following a decades-spanning foot pilgrimage across India and Nepal.</w:t>
       </w:r>
     </w:p>
     <w:p>
@@ -940,7 +940,7 @@
           <w:sz w:val="25"/>
           <w:szCs w:val="25"/>
         </w:rPr>
-        <w:t xml:space="preserve">A Confluence of Devotion and Patriotism at SS Jain Sabha</w:t>
+        <w:t xml:space="preserve">Muni Sudhasagar Ji Maharaj Addresses Jain Youth During Indore Chaturmas</w:t>
       </w:r>
     </w:p>
     <w:p>
@@ -956,7 +956,7 @@
           <w:sz w:val="17"/>
           <w:szCs w:val="17"/>
         </w:rPr>
-        <w:t xml:space="preserve">YAMUNA NAGAR, HARYANA · SOURCE: AMAR UJALA · AUG 18, 2026</w:t>
+        <w:t xml:space="preserve">INDORE, MADHYA PRADESH · SOURCE: PALIWALWANI · AUG 9, 2026</w:t>
       </w:r>
       <w:r>
         <w:rPr>
@@ -969,7 +969,7 @@
         </w:rPr>
         <w:t xml:space="preserve">  →  </w:t>
       </w:r>
-      <w:hyperlink w:history="1" r:id="rIdn99nccnufa0jkd9epgyip">
+      <w:hyperlink w:history="1" r:id="rIdvwsmogmn-3j0evdfzxs2w">
         <w:r>
           <w:rPr>
             <w:rFonts w:ascii="Arial" w:cs="Arial" w:eastAsia="Arial" w:hAnsi="Arial"/>
@@ -995,30 +995,13 @@
           <w:sz w:val="21"/>
           <w:szCs w:val="21"/>
         </w:rPr>
-        <w:t xml:space="preserve">During ongoing Chaturmas, the community held a joint Independence Day and Hariyali Teej celebration, blending devotional and patriotic programming.</w:t>
-      </w:r>
-    </w:p>
-    <w:p>
-      <w:pPr>
-        <w:pStyle w:val="Heading1"/>
-        <w:spacing w:after="60" w:before="400"/>
-      </w:pPr>
-      <w:r>
-        <w:rPr>
-          <w:rFonts w:ascii="Georgia" w:cs="Georgia" w:eastAsia="Georgia" w:hAnsi="Georgia"/>
-          <w:b/>
-          <w:bCs/>
-          <w:color w:val="1C1712"/>
-          <w:sz w:val="30"/>
-          <w:szCs w:val="30"/>
-        </w:rPr>
-        <w:t xml:space="preserve">New Temples &amp; Tirth Renovation</w:t>
+        <w:t xml:space="preserve">Muni Sudhasagar Ji Maharaj, in Indore for Chaturmas since July 26, delivered a special guidance address to Jain youth at Rishabh Sabha Hall, Adinath Jinalaya.</w:t>
       </w:r>
     </w:p>
     <w:p>
       <w:pPr>
         <w:pBdr>
-          <w:bottom w:val="single" w:color="D8CDB4" w:sz="4"/>
+          <w:top w:val="single" w:color="D8CDB4" w:sz="4"/>
         </w:pBdr>
         <w:spacing w:after="160"/>
       </w:pPr>
@@ -1036,7 +1019,7 @@
           <w:sz w:val="25"/>
           <w:szCs w:val="25"/>
         </w:rPr>
-        <w:t xml:space="preserve">Shri Shantinath Temple's Pratishtha Mahotsav Held in Avanti Nagar</w:t>
+        <w:t xml:space="preserve">A Confluence of Devotion and Patriotism at SS Jain Sabha</w:t>
       </w:r>
     </w:p>
     <w:p>
@@ -1052,7 +1035,7 @@
           <w:sz w:val="17"/>
           <w:szCs w:val="17"/>
         </w:rPr>
-        <w:t xml:space="preserve">HYDERABAD, TELANGANA · SOURCE: DAILY HINDI MILAP · JUL 17–19, 2026</w:t>
+        <w:t xml:space="preserve">YAMUNA NAGAR, HARYANA · SOURCE: AMAR UJALA · AUG 18, 2026</w:t>
       </w:r>
       <w:r>
         <w:rPr>
@@ -1065,7 +1048,7 @@
         </w:rPr>
         <w:t xml:space="preserve">  →  </w:t>
       </w:r>
-      <w:hyperlink w:history="1" r:id="rId4aj1yy-ujltrouj5ec39e">
+      <w:hyperlink w:history="1" r:id="rIdpq2lmt-rfdign7cs6ts5x">
         <w:r>
           <w:rPr>
             <w:rFonts w:ascii="Arial" w:cs="Arial" w:eastAsia="Arial" w:hAnsi="Arial"/>
@@ -1091,13 +1074,30 @@
           <w:sz w:val="21"/>
           <w:szCs w:val="21"/>
         </w:rPr>
-        <w:t xml:space="preserve">A consecration festival (Pratishtha Mahotsav) was held for the newly built Shri Shantinath Temple at Aviradh Park, Avanti Nagar.</w:t>
+        <w:t xml:space="preserve">During ongoing Chaturmas, the community held a joint Independence Day and Hariyali Teej celebration, blending devotional and patriotic programming.</w:t>
+      </w:r>
+    </w:p>
+    <w:p>
+      <w:pPr>
+        <w:pStyle w:val="Heading1"/>
+        <w:spacing w:after="60" w:before="400"/>
+      </w:pPr>
+      <w:r>
+        <w:rPr>
+          <w:rFonts w:ascii="Georgia" w:cs="Georgia" w:eastAsia="Georgia" w:hAnsi="Georgia"/>
+          <w:b/>
+          <w:bCs/>
+          <w:color w:val="1C1712"/>
+          <w:sz w:val="30"/>
+          <w:szCs w:val="30"/>
+        </w:rPr>
+        <w:t xml:space="preserve">New Temples &amp; Tirth Renovation</w:t>
       </w:r>
     </w:p>
     <w:p>
       <w:pPr>
         <w:pBdr>
-          <w:top w:val="single" w:color="D8CDB4" w:sz="4"/>
+          <w:bottom w:val="single" w:color="D8CDB4" w:sz="4"/>
         </w:pBdr>
         <w:spacing w:after="160"/>
       </w:pPr>
@@ -1115,7 +1115,7 @@
           <w:sz w:val="25"/>
           <w:szCs w:val="25"/>
         </w:rPr>
-        <w:t xml:space="preserve">Yaksha-Yakshi Pratishtha &amp; Vasatika Foundation-Laying Announced</w:t>
+        <w:t xml:space="preserve">Shri Shantinath Temple's Pratishtha Mahotsav Held in Avanti Nagar</w:t>
       </w:r>
     </w:p>
     <w:p>
@@ -1131,7 +1131,7 @@
           <w:sz w:val="17"/>
           <w:szCs w:val="17"/>
         </w:rPr>
-        <w:t xml:space="preserve">JAWAS, UDAIPUR DISTRICT, RAJASTHAN · SOURCE: PRATAHKAL · REPORTED ~AUG 17, 2026</w:t>
+        <w:t xml:space="preserve">HYDERABAD, TELANGANA · SOURCE: DAILY HINDI MILAP · JUL 17–19, 2026</w:t>
       </w:r>
       <w:r>
         <w:rPr>
@@ -1144,7 +1144,7 @@
         </w:rPr>
         <w:t xml:space="preserve">  →  </w:t>
       </w:r>
-      <w:hyperlink w:history="1" r:id="rId8du2s3iwb_t31ng_1ypru">
+      <w:hyperlink w:history="1" r:id="rIdkne5u0lwwehwxejalz0mf">
         <w:r>
           <w:rPr>
             <w:rFonts w:ascii="Arial" w:cs="Arial" w:eastAsia="Arial" w:hAnsi="Arial"/>
@@ -1170,7 +1170,7 @@
           <w:sz w:val="21"/>
           <w:szCs w:val="21"/>
         </w:rPr>
-        <w:t xml:space="preserve">A mahotsav announced for August 30 will install Yaksha-Yakshi deities and lay the foundation for a new pilgrim rest house ("Vasatika") at Sri Adinath Digambar Jain Temple.</w:t>
+        <w:t xml:space="preserve">A consecration festival (Pratishtha Mahotsav) was held for the newly built Shri Shantinath Temple at Aviradh Park, Avanti Nagar.</w:t>
       </w:r>
     </w:p>
     <w:p>
@@ -1194,7 +1194,7 @@
           <w:sz w:val="25"/>
           <w:szCs w:val="25"/>
         </w:rPr>
-        <w:t xml:space="preserve">Hindu-Jain Temple of Monroeville Marks 40th Anniversary With Re-Inauguration Ceremony</w:t>
+        <w:t xml:space="preserve">Yaksha-Yakshi Pratishtha &amp; Vasatika Foundation-Laying Announced</w:t>
       </w:r>
     </w:p>
     <w:p>
@@ -1210,7 +1210,7 @@
           <w:sz w:val="17"/>
           <w:szCs w:val="17"/>
         </w:rPr>
-        <w:t xml:space="preserve">PITTSBURGH, PENNSYLVANIA, USA · SOURCE: EASTERN EYE, RELIGION NEWS ASSOCIATION · AUG 10–11, 2026</w:t>
+        <w:t xml:space="preserve">JAWAS, UDAIPUR DISTRICT, RAJASTHAN · SOURCE: PRATAHKAL · REPORTED ~AUG 17, 2026</w:t>
       </w:r>
       <w:r>
         <w:rPr>
@@ -1223,7 +1223,7 @@
         </w:rPr>
         <w:t xml:space="preserve">  →  </w:t>
       </w:r>
-      <w:hyperlink w:history="1" r:id="rIdwfvugxew39unr_cse2wyb">
+      <w:hyperlink w:history="1" r:id="rIdifjehzsx_z_3w3onhqcc-">
         <w:r>
           <w:rPr>
             <w:rFonts w:ascii="Arial" w:cs="Arial" w:eastAsia="Arial" w:hAnsi="Arial"/>
@@ -1249,30 +1249,13 @@
           <w:sz w:val="21"/>
           <w:szCs w:val="21"/>
         </w:rPr>
-        <w:t xml:space="preserve">The joint Hindu-Jain temple — the first of its kind globally, where Hindus and both Shwetambar and Digambar Jains worship together — held a Shikhar Puja and re-inauguration ceremony marking 40 years since its 1984 founding, with its five domes ritually consecrated.</w:t>
-      </w:r>
-    </w:p>
-    <w:p>
-      <w:pPr>
-        <w:pStyle w:val="Heading1"/>
-        <w:spacing w:after="60" w:before="400"/>
-      </w:pPr>
-      <w:r>
-        <w:rPr>
-          <w:rFonts w:ascii="Georgia" w:cs="Georgia" w:eastAsia="Georgia" w:hAnsi="Georgia"/>
-          <w:b/>
-          <w:bCs/>
-          <w:color w:val="1C1712"/>
-          <w:sz w:val="30"/>
-          <w:szCs w:val="30"/>
-        </w:rPr>
-        <w:t xml:space="preserve">Jain Tirth News</w:t>
+        <w:t xml:space="preserve">A mahotsav announced for August 30 will install Yaksha-Yakshi deities and lay the foundation for a new pilgrim rest house ("Vasatika") at Sri Adinath Digambar Jain Temple.</w:t>
       </w:r>
     </w:p>
     <w:p>
       <w:pPr>
         <w:pBdr>
-          <w:bottom w:val="single" w:color="D8CDB4" w:sz="4"/>
+          <w:top w:val="single" w:color="D8CDB4" w:sz="4"/>
         </w:pBdr>
         <w:spacing w:after="160"/>
       </w:pPr>
@@ -1290,7 +1273,7 @@
           <w:sz w:val="25"/>
           <w:szCs w:val="25"/>
         </w:rPr>
-        <w:t xml:space="preserve">World Jain Organisation Renews Demands Over Sammed Shikharji Security</w:t>
+        <w:t xml:space="preserve">Hindu-Jain Temple of Monroeville Marks 40th Anniversary With Re-Inauguration Ceremony</w:t>
       </w:r>
     </w:p>
     <w:p>
@@ -1306,7 +1289,7 @@
           <w:sz w:val="17"/>
           <w:szCs w:val="17"/>
         </w:rPr>
-        <w:t xml:space="preserve">SAMMED SHIKHARJI, JHARKHAND · SOURCE: PRABHAT KHABAR · ~AUG 11, 2026</w:t>
+        <w:t xml:space="preserve">PITTSBURGH, PENNSYLVANIA, USA · SOURCE: EASTERN EYE, RELIGION NEWS ASSOCIATION · AUG 10–11, 2026</w:t>
       </w:r>
       <w:r>
         <w:rPr>
@@ -1319,7 +1302,7 @@
         </w:rPr>
         <w:t xml:space="preserve">  →  </w:t>
       </w:r>
-      <w:hyperlink w:history="1" r:id="rIdrdyalw7jruwjrsyg2jbzk">
+      <w:hyperlink w:history="1" r:id="rId1oahktleuk6vubvl_qsmh">
         <w:r>
           <w:rPr>
             <w:rFonts w:ascii="Arial" w:cs="Arial" w:eastAsia="Arial" w:hAnsi="Arial"/>
@@ -1345,7 +1328,7 @@
           <w:sz w:val="21"/>
           <w:szCs w:val="21"/>
         </w:rPr>
-        <w:t xml:space="preserve">Renewed calls for a complete motorbike ban on the hill, removal of illegal encroachments, and additional CCTV coverage to protect the tirth's sanctity and security.</w:t>
+        <w:t xml:space="preserve">The joint Hindu-Jain temple — the first of its kind globally, where Hindus and both Shwetambar and Digambar Jains worship together — held a Shikhar Puja and re-inauguration ceremony marking 40 years since its 1984 founding, with its five domes ritually consecrated.</w:t>
       </w:r>
     </w:p>
     <w:p>
@@ -1362,7 +1345,7 @@
           <w:sz w:val="30"/>
           <w:szCs w:val="30"/>
         </w:rPr>
-        <w:t xml:space="preserve">Jain Vihar</w:t>
+        <w:t xml:space="preserve">Jain Tirth News</w:t>
       </w:r>
     </w:p>
     <w:p>
@@ -1386,7 +1369,7 @@
           <w:sz w:val="25"/>
           <w:szCs w:val="25"/>
         </w:rPr>
-        <w:t xml:space="preserve">Muni Pramansagar Ji's Sangh Completes Charan Vandana of Sammed Shikharji</w:t>
+        <w:t xml:space="preserve">World Jain Organisation Renews Demands Over Sammed Shikharji Security</w:t>
       </w:r>
     </w:p>
     <w:p>
@@ -1402,7 +1385,7 @@
           <w:sz w:val="17"/>
           <w:szCs w:val="17"/>
         </w:rPr>
-        <w:t xml:space="preserve">SAMMED SHIKHARJI, JHARKHAND · SOURCE: MUNIPRAMANSAGAR.NET · JUL 15–16, 2026</w:t>
+        <w:t xml:space="preserve">SAMMED SHIKHARJI, JHARKHAND · SOURCE: PRABHAT KHABAR · ~AUG 11, 2026</w:t>
       </w:r>
       <w:r>
         <w:rPr>
@@ -1415,7 +1398,7 @@
         </w:rPr>
         <w:t xml:space="preserve">  →  </w:t>
       </w:r>
-      <w:hyperlink w:history="1" r:id="rIdur-uy7-20o_dtlmlw_kuh">
+      <w:hyperlink w:history="1" r:id="rIdnqdwzqqjmdahrb_6rhck1">
         <w:r>
           <w:rPr>
             <w:rFonts w:ascii="Arial" w:cs="Arial" w:eastAsia="Arial" w:hAnsi="Arial"/>
@@ -1441,13 +1424,30 @@
           <w:sz w:val="21"/>
           <w:szCs w:val="21"/>
         </w:rPr>
-        <w:t xml:space="preserve">Digambar Jain Muni Pramansagar Ji Maharaj and his monastic sangh completed a foot-pilgrimage veneration circuit of the sacred Sammed Shikharji hill, followed the next day by a "mangal milan" with the viharing sangh of Acharya Sambhavsagar Ji Maharaj at the same tirth.</w:t>
+        <w:t xml:space="preserve">Renewed calls for a complete motorbike ban on the hill, removal of illegal encroachments, and additional CCTV coverage to protect the tirth's sanctity and security.</w:t>
+      </w:r>
+    </w:p>
+    <w:p>
+      <w:pPr>
+        <w:pStyle w:val="Heading1"/>
+        <w:spacing w:after="60" w:before="400"/>
+      </w:pPr>
+      <w:r>
+        <w:rPr>
+          <w:rFonts w:ascii="Georgia" w:cs="Georgia" w:eastAsia="Georgia" w:hAnsi="Georgia"/>
+          <w:b/>
+          <w:bCs/>
+          <w:color w:val="1C1712"/>
+          <w:sz w:val="30"/>
+          <w:szCs w:val="30"/>
+        </w:rPr>
+        <w:t xml:space="preserve">Jain Vihar</w:t>
       </w:r>
     </w:p>
     <w:p>
       <w:pPr>
         <w:pBdr>
-          <w:top w:val="single" w:color="D8CDB4" w:sz="4"/>
+          <w:bottom w:val="single" w:color="D8CDB4" w:sz="4"/>
         </w:pBdr>
         <w:spacing w:after="160"/>
       </w:pPr>
@@ -1465,7 +1465,7 @@
           <w:sz w:val="25"/>
           <w:szCs w:val="25"/>
         </w:rPr>
-        <w:t xml:space="preserve">Sadhvi Mani Prabha's Mandal Completes Vihar Into Begun</w:t>
+        <w:t xml:space="preserve">Muni Pramansagar Ji's Sangh Completes Charan Vandana of Sammed Shikharji</w:t>
       </w:r>
     </w:p>
     <w:p>
@@ -1481,7 +1481,7 @@
           <w:sz w:val="17"/>
           <w:szCs w:val="17"/>
         </w:rPr>
-        <w:t xml:space="preserve">BEGUN, RAJASTHAN · SOURCE: PRATAHKAL · MID-JUL 2026</w:t>
+        <w:t xml:space="preserve">SAMMED SHIKHARJI, JHARKHAND · SOURCE: MUNIPRAMANSAGAR.NET · JUL 15–16, 2026</w:t>
       </w:r>
       <w:r>
         <w:rPr>
@@ -1494,7 +1494,7 @@
         </w:rPr>
         <w:t xml:space="preserve">  →  </w:t>
       </w:r>
-      <w:hyperlink w:history="1" r:id="rIdhroek5tfh8zydlpdttudi">
+      <w:hyperlink w:history="1" r:id="rIdbeu74erw2_k0c7euqlocs">
         <w:r>
           <w:rPr>
             <w:rFonts w:ascii="Arial" w:cs="Arial" w:eastAsia="Arial" w:hAnsi="Arial"/>
@@ -1520,30 +1520,13 @@
           <w:sz w:val="21"/>
           <w:szCs w:val="21"/>
         </w:rPr>
-        <w:t xml:space="preserve">A group of Jain sadhvis led by Sadhvi Mani Prabha walked a multi-day route from Sukh Shanti Nagar to Begun town, ahead of their formal Chaturmas entry ceremony.</w:t>
-      </w:r>
-    </w:p>
-    <w:p>
-      <w:pPr>
-        <w:pStyle w:val="Heading1"/>
-        <w:spacing w:after="60" w:before="400"/>
-      </w:pPr>
-      <w:r>
-        <w:rPr>
-          <w:rFonts w:ascii="Georgia" w:cs="Georgia" w:eastAsia="Georgia" w:hAnsi="Georgia"/>
-          <w:b/>
-          <w:bCs/>
-          <w:color w:val="1C1712"/>
-          <w:sz w:val="30"/>
-          <w:szCs w:val="30"/>
-        </w:rPr>
-        <w:t xml:space="preserve">The Jain Foundation News</w:t>
+        <w:t xml:space="preserve">Digambar Jain Muni Pramansagar Ji Maharaj and his monastic sangh completed a foot-pilgrimage veneration circuit of the sacred Sammed Shikharji hill, followed the next day by a "mangal milan" with the viharing sangh of Acharya Sambhavsagar Ji Maharaj at the same tirth.</w:t>
       </w:r>
     </w:p>
     <w:p>
       <w:pPr>
         <w:pBdr>
-          <w:bottom w:val="single" w:color="D8CDB4" w:sz="4"/>
+          <w:top w:val="single" w:color="D8CDB4" w:sz="4"/>
         </w:pBdr>
         <w:spacing w:after="160"/>
       </w:pPr>
@@ -1561,7 +1544,7 @@
           <w:sz w:val="25"/>
           <w:szCs w:val="25"/>
         </w:rPr>
-        <w:t xml:space="preserve">Global Immersion Summer School Draws Scholars from 12+ Countries to Jain Vishva Bharati</w:t>
+        <w:t xml:space="preserve">Sadhvi Mani Prabha's Mandal Completes Vihar Into Begun</w:t>
       </w:r>
     </w:p>
     <w:p>
@@ -1577,7 +1560,7 @@
           <w:sz w:val="17"/>
           <w:szCs w:val="17"/>
         </w:rPr>
-        <w:t xml:space="preserve">LADNUN, RAJASTHAN · SOURCE: AMERICAN BAZAAR · PROGRAM THROUGH AUG 7, 2026</w:t>
+        <w:t xml:space="preserve">BEGUN, RAJASTHAN · SOURCE: PRATAHKAL · MID-JUL 2026</w:t>
       </w:r>
       <w:r>
         <w:rPr>
@@ -1590,7 +1573,7 @@
         </w:rPr>
         <w:t xml:space="preserve">  →  </w:t>
       </w:r>
-      <w:hyperlink w:history="1" r:id="rIdvj-2k1qlqlmfnjjgavdb_">
+      <w:hyperlink w:history="1" r:id="rIdmup08uosmnfvmlu1m1aii">
         <w:r>
           <w:rPr>
             <w:rFonts w:ascii="Arial" w:cs="Arial" w:eastAsia="Arial" w:hAnsi="Arial"/>
@@ -1616,7 +1599,7 @@
           <w:sz w:val="21"/>
           <w:szCs w:val="21"/>
         </w:rPr>
-        <w:t xml:space="preserve">Nearly 40 students and scholars from more than a dozen countries attended a three-week "Jain Way of Life" program covering Jain philosophy, Prakrit/Sanskrit, and Preksha meditation, engaging directly with Acharya Mahashraman and Terapanth monastics.</w:t>
+        <w:t xml:space="preserve">A group of Jain sadhvis led by Sadhvi Mani Prabha walked a multi-day route from Sukh Shanti Nagar to Begun town, ahead of their formal Chaturmas entry ceremony.</w:t>
       </w:r>
     </w:p>
     <w:p>
@@ -1633,7 +1616,7 @@
           <w:sz w:val="30"/>
           <w:szCs w:val="30"/>
         </w:rPr>
-        <w:t xml:space="preserve">Jain Leadership / Forums</w:t>
+        <w:t xml:space="preserve">The Jain Foundation News</w:t>
       </w:r>
     </w:p>
     <w:p>
@@ -1657,7 +1640,7 @@
           <w:sz w:val="25"/>
           <w:szCs w:val="25"/>
         </w:rPr>
-        <w:t xml:space="preserve">JITO USA Launches New Miami Chapter</w:t>
+        <w:t xml:space="preserve">Global Immersion Summer School Draws Scholars from 12+ Countries to Jain Vishva Bharati</w:t>
       </w:r>
     </w:p>
     <w:p>
@@ -1673,7 +1656,7 @@
           <w:sz w:val="17"/>
           <w:szCs w:val="17"/>
         </w:rPr>
-        <w:t xml:space="preserve">MIAMI, FLORIDA, USA · SOURCE: JITO USA · AUG 9, 2026</w:t>
+        <w:t xml:space="preserve">LADNUN, RAJASTHAN · SOURCE: AMERICAN BAZAAR · PROGRAM THROUGH AUG 7, 2026</w:t>
       </w:r>
       <w:r>
         <w:rPr>
@@ -1686,7 +1669,7 @@
         </w:rPr>
         <w:t xml:space="preserve">  →  </w:t>
       </w:r>
-      <w:hyperlink w:history="1" r:id="rIdtntm0yhuyxvyopwlhowgv">
+      <w:hyperlink w:history="1" r:id="rIdg6ur7qhsjn2tk109xd3pg">
         <w:r>
           <w:rPr>
             <w:rFonts w:ascii="Arial" w:cs="Arial" w:eastAsia="Arial" w:hAnsi="Arial"/>
@@ -1712,13 +1695,30 @@
           <w:sz w:val="21"/>
           <w:szCs w:val="21"/>
         </w:rPr>
-        <w:t xml:space="preserve">The Jain International Trade Organisation's US arm launched a Miami initiative — a hybrid in-person and video gathering connecting the local Jain business community with JITO leadership in India. 21 founding members took the JITO oath at the launch, hosted at Florida International University.</w:t>
+        <w:t xml:space="preserve">Nearly 40 students and scholars from more than a dozen countries attended a three-week "Jain Way of Life" program covering Jain philosophy, Prakrit/Sanskrit, and Preksha meditation, engaging directly with Acharya Mahashraman and Terapanth monastics.</w:t>
+      </w:r>
+    </w:p>
+    <w:p>
+      <w:pPr>
+        <w:pStyle w:val="Heading1"/>
+        <w:spacing w:after="60" w:before="400"/>
+      </w:pPr>
+      <w:r>
+        <w:rPr>
+          <w:rFonts w:ascii="Georgia" w:cs="Georgia" w:eastAsia="Georgia" w:hAnsi="Georgia"/>
+          <w:b/>
+          <w:bCs/>
+          <w:color w:val="1C1712"/>
+          <w:sz w:val="30"/>
+          <w:szCs w:val="30"/>
+        </w:rPr>
+        <w:t xml:space="preserve">Jain Leadership / Forums</w:t>
       </w:r>
     </w:p>
     <w:p>
       <w:pPr>
         <w:pBdr>
-          <w:top w:val="single" w:color="D8CDB4" w:sz="4"/>
+          <w:bottom w:val="single" w:color="D8CDB4" w:sz="4"/>
         </w:pBdr>
         <w:spacing w:after="160"/>
       </w:pPr>
@@ -1736,7 +1736,7 @@
           <w:sz w:val="25"/>
           <w:szCs w:val="25"/>
         </w:rPr>
-        <w:t xml:space="preserve">Houston's Swatantra Jain Named 2026 Sangh Seva Puraskar Recipient</w:t>
+        <w:t xml:space="preserve">JITO USA Launches New Miami Chapter</w:t>
       </w:r>
     </w:p>
     <w:p>
@@ -1752,7 +1752,7 @@
           <w:sz w:val="17"/>
           <w:szCs w:val="17"/>
         </w:rPr>
-        <w:t xml:space="preserve">HOUSTON, TEXAS, USA · SOURCE: MANEESH MEDIA · JUL 2026</w:t>
+        <w:t xml:space="preserve">MIAMI, FLORIDA, USA · SOURCE: JITO USA · AUG 9, 2026</w:t>
       </w:r>
       <w:r>
         <w:rPr>
@@ -1765,7 +1765,7 @@
         </w:rPr>
         <w:t xml:space="preserve">  →  </w:t>
       </w:r>
-      <w:hyperlink w:history="1" r:id="rIdqhmz4rh9lno7g3ord0umo">
+      <w:hyperlink w:history="1" r:id="rId7pl8yhzznpwlnf1gohsb2">
         <w:r>
           <w:rPr>
             <w:rFonts w:ascii="Arial" w:cs="Arial" w:eastAsia="Arial" w:hAnsi="Arial"/>
@@ -1791,30 +1791,13 @@
           <w:sz w:val="21"/>
           <w:szCs w:val="21"/>
         </w:rPr>
-        <w:t xml:space="preserve">Swatantra Jain, founder and chairman of Jain Vishwa Bharati–Houston, was announced as recipient of the Sangh Seva Puraskar 2026 — conferred by Jain Vishwa Bharati, Ladnun — recognising decades of institution-building and service to the diaspora Jain community.</w:t>
-      </w:r>
-    </w:p>
-    <w:p>
-      <w:pPr>
-        <w:pStyle w:val="Heading1"/>
-        <w:spacing w:after="60" w:before="400"/>
-      </w:pPr>
-      <w:r>
-        <w:rPr>
-          <w:rFonts w:ascii="Georgia" w:cs="Georgia" w:eastAsia="Georgia" w:hAnsi="Georgia"/>
-          <w:b/>
-          <w:bCs/>
-          <w:color w:val="1C1712"/>
-          <w:sz w:val="30"/>
-          <w:szCs w:val="30"/>
-        </w:rPr>
-        <w:t xml:space="preserve">Jain Business &amp; Trade</w:t>
+        <w:t xml:space="preserve">The Jain International Trade Organisation's US arm launched a Miami initiative — a hybrid in-person and video gathering connecting the local Jain business community with JITO leadership in India. 21 founding members took the JITO oath at the launch, hosted at Florida International University.</w:t>
       </w:r>
     </w:p>
     <w:p>
       <w:pPr>
         <w:pBdr>
-          <w:bottom w:val="single" w:color="D8CDB4" w:sz="4"/>
+          <w:top w:val="single" w:color="D8CDB4" w:sz="4"/>
         </w:pBdr>
         <w:spacing w:after="160"/>
       </w:pPr>
@@ -1832,7 +1815,7 @@
           <w:sz w:val="25"/>
           <w:szCs w:val="25"/>
         </w:rPr>
-        <w:t xml:space="preserve">Bangalore Blasters Unveiled for Inaugural JITO Premier League</w:t>
+        <w:t xml:space="preserve">Houston's Swatantra Jain Named 2026 Sangh Seva Puraskar Recipient</w:t>
       </w:r>
     </w:p>
     <w:p>
@@ -1848,7 +1831,7 @@
           <w:sz w:val="17"/>
           <w:szCs w:val="17"/>
         </w:rPr>
-        <w:t xml:space="preserve">BENGALURU, KARNATAKA · SOURCE: THE TRIBUNE, ANI · AUG 11–12, 2026</w:t>
+        <w:t xml:space="preserve">HOUSTON, TEXAS, USA · SOURCE: MANEESH MEDIA · JUL 2026</w:t>
       </w:r>
       <w:r>
         <w:rPr>
@@ -1861,7 +1844,7 @@
         </w:rPr>
         <w:t xml:space="preserve">  →  </w:t>
       </w:r>
-      <w:hyperlink w:history="1" r:id="rIdzxdzrngvgdg8ghniuqo8x">
+      <w:hyperlink w:history="1" r:id="rIdwwg6ovzwjbopeknkopqc2">
         <w:r>
           <w:rPr>
             <w:rFonts w:ascii="Arial" w:cs="Arial" w:eastAsia="Arial" w:hAnsi="Arial"/>
@@ -1887,7 +1870,7 @@
           <w:sz w:val="21"/>
           <w:szCs w:val="21"/>
         </w:rPr>
-        <w:t xml:space="preserve">Navrathan Jewellers and Jain Sports Group jointly launched the "Bangalore Blasters" cricket franchise for JITO Premier League Season 1, with cricket legend Kapil Dev attending, ahead of the tournament in Colombo (Aug 24–Sept 5).</w:t>
+        <w:t xml:space="preserve">Swatantra Jain, founder and chairman of Jain Vishwa Bharati–Houston, was announced as recipient of the Sangh Seva Puraskar 2026 — conferred by Jain Vishwa Bharati, Ladnun — recognising decades of institution-building and service to the diaspora Jain community.</w:t>
       </w:r>
     </w:p>
     <w:p>
@@ -1904,7 +1887,7 @@
           <w:sz w:val="30"/>
           <w:szCs w:val="30"/>
         </w:rPr>
-        <w:t xml:space="preserve">Other Community News / Announcements</w:t>
+        <w:t xml:space="preserve">Jain Business &amp; Trade</w:t>
       </w:r>
     </w:p>
     <w:p>
@@ -1928,7 +1911,7 @@
           <w:sz w:val="25"/>
           <w:szCs w:val="25"/>
         </w:rPr>
-        <w:t xml:space="preserve">Rashtrahit Vichar Goshthi evam Samman Samaroh</w:t>
+        <w:t xml:space="preserve">Business Families Bid Up to ₹53 Crore for the Honor of Installing the Ceremonial Kalash</w:t>
       </w:r>
     </w:p>
     <w:p>
@@ -1944,7 +1927,7 @@
           <w:sz w:val="17"/>
           <w:szCs w:val="17"/>
         </w:rPr>
-        <w:t xml:space="preserve">LUCKNOW, UTTAR PRADESH · SOURCE: AMAR BHARTI · AUG 9, 2026</w:t>
+        <w:t xml:space="preserve">DALALBAAG, INDORE, MADHYA PRADESH · SOURCE: AMAR UJALA, LALLURAM · JUL 30, 2026</w:t>
       </w:r>
       <w:r>
         <w:rPr>
@@ -1957,7 +1940,7 @@
         </w:rPr>
         <w:t xml:space="preserve">  →  </w:t>
       </w:r>
-      <w:hyperlink w:history="1" r:id="rIdt41kzm99qcqgejepnvyxh">
+      <w:hyperlink w:history="1" r:id="rIdlhzszzuadsfhpvsgffowf">
         <w:r>
           <w:rPr>
             <w:rFonts w:ascii="Arial" w:cs="Arial" w:eastAsia="Arial" w:hAnsi="Arial"/>
@@ -1983,7 +1966,7 @@
           <w:sz w:val="21"/>
           <w:szCs w:val="21"/>
         </w:rPr>
-        <w:t xml:space="preserve">A discussion forum on national interest paired with a felicitation ceremony honoring distinguished Jain community members across professional fields — chartered accountants, doctors, lawyers, professors, engineers, and government officials.</w:t>
+        <w:t xml:space="preserve">Ahead of Muni Sudhasagar Ji's four-month Chaturmas stay in Indore, trading and business families placed devotional bids — a traditional boli practice — to install the mangal kalash, with total bids across the community reaching ₹53 crore. The top individual bid, ₹16.16 crore, was shared by Sapna Manish Godha and Naveen Anand Godha, securing the first kalash. Senior Acharya Sunil Sagar Maharaj publicly urged that such offerings should serve devotion rather than become a display of wealth, prompting community reflection on the scale of the bidding.</w:t>
       </w:r>
     </w:p>
     <w:p>
@@ -2007,6 +1990,260 @@
           <w:sz w:val="25"/>
           <w:szCs w:val="25"/>
         </w:rPr>
+        <w:t xml:space="preserve">Bangalore Blasters Unveiled for Inaugural JITO Premier League</w:t>
+      </w:r>
+    </w:p>
+    <w:p>
+      <w:pPr>
+        <w:spacing w:after="40"/>
+      </w:pPr>
+      <w:r>
+        <w:rPr>
+          <w:rFonts w:ascii="Arial" w:cs="Arial" w:eastAsia="Arial" w:hAnsi="Arial"/>
+          <w:b/>
+          <w:bCs/>
+          <w:color w:val="B9541F"/>
+          <w:sz w:val="17"/>
+          <w:szCs w:val="17"/>
+        </w:rPr>
+        <w:t xml:space="preserve">BENGALURU, KARNATAKA · SOURCE: THE TRIBUNE, ANI · AUG 11–12, 2026</w:t>
+      </w:r>
+      <w:r>
+        <w:rPr>
+          <w:rFonts w:ascii="Arial" w:cs="Arial" w:eastAsia="Arial" w:hAnsi="Arial"/>
+          <w:b/>
+          <w:bCs/>
+          <w:color w:val="B9541F"/>
+          <w:sz w:val="17"/>
+          <w:szCs w:val="17"/>
+        </w:rPr>
+        <w:t xml:space="preserve">  →  </w:t>
+      </w:r>
+      <w:hyperlink w:history="1" r:id="rId0kqykyam54jncgxl9qzxj">
+        <w:r>
+          <w:rPr>
+            <w:rFonts w:ascii="Arial" w:cs="Arial" w:eastAsia="Arial" w:hAnsi="Arial"/>
+            <w:b/>
+            <w:bCs/>
+            <w:color w:val="1155CC"/>
+            <w:sz w:val="17"/>
+            <w:szCs w:val="17"/>
+            <w:u w:val="single"/>
+          </w:rPr>
+          <w:t xml:space="preserve">READ FULL ARTICLE</w:t>
+        </w:r>
+      </w:hyperlink>
+    </w:p>
+    <w:p>
+      <w:pPr>
+        <w:spacing w:after="80"/>
+      </w:pPr>
+      <w:r>
+        <w:rPr>
+          <w:rFonts w:ascii="Arial" w:cs="Arial" w:eastAsia="Arial" w:hAnsi="Arial"/>
+          <w:color w:val="33291F"/>
+          <w:sz w:val="21"/>
+          <w:szCs w:val="21"/>
+        </w:rPr>
+        <w:t xml:space="preserve">Navrathan Jewellers and Jain Sports Group jointly launched the "Bangalore Blasters" cricket franchise for JITO Premier League Season 1, with cricket legend Kapil Dev attending, ahead of the tournament in Colombo (Aug 24–Sept 5).</w:t>
+      </w:r>
+    </w:p>
+    <w:p>
+      <w:pPr>
+        <w:pStyle w:val="Heading1"/>
+        <w:spacing w:after="60" w:before="400"/>
+      </w:pPr>
+      <w:r>
+        <w:rPr>
+          <w:rFonts w:ascii="Georgia" w:cs="Georgia" w:eastAsia="Georgia" w:hAnsi="Georgia"/>
+          <w:b/>
+          <w:bCs/>
+          <w:color w:val="1C1712"/>
+          <w:sz w:val="30"/>
+          <w:szCs w:val="30"/>
+        </w:rPr>
+        <w:t xml:space="preserve">Other Community News / Announcements</w:t>
+      </w:r>
+    </w:p>
+    <w:p>
+      <w:pPr>
+        <w:pBdr>
+          <w:bottom w:val="single" w:color="D8CDB4" w:sz="4"/>
+        </w:pBdr>
+        <w:spacing w:after="160"/>
+      </w:pPr>
+    </w:p>
+    <w:p>
+      <w:pPr>
+        <w:spacing w:after="60" w:before="120"/>
+      </w:pPr>
+      <w:r>
+        <w:rPr>
+          <w:rFonts w:ascii="Georgia" w:cs="Georgia" w:eastAsia="Georgia" w:hAnsi="Georgia"/>
+          <w:b/>
+          <w:bCs/>
+          <w:color w:val="1C1712"/>
+          <w:sz w:val="25"/>
+          <w:szCs w:val="25"/>
+        </w:rPr>
+        <w:t xml:space="preserve">'Mangal Milan' of Jain Monks Carries a Message of Non-Violence</w:t>
+      </w:r>
+    </w:p>
+    <w:p>
+      <w:pPr>
+        <w:spacing w:after="40"/>
+      </w:pPr>
+      <w:r>
+        <w:rPr>
+          <w:rFonts w:ascii="Arial" w:cs="Arial" w:eastAsia="Arial" w:hAnsi="Arial"/>
+          <w:b/>
+          <w:bCs/>
+          <w:color w:val="B9541F"/>
+          <w:sz w:val="17"/>
+          <w:szCs w:val="17"/>
+        </w:rPr>
+        <w:t xml:space="preserve">CHITRAKOOT, UTTAR PRADESH · SOURCE: AMAR UJALA · JUL 13, 2026</w:t>
+      </w:r>
+      <w:r>
+        <w:rPr>
+          <w:rFonts w:ascii="Arial" w:cs="Arial" w:eastAsia="Arial" w:hAnsi="Arial"/>
+          <w:b/>
+          <w:bCs/>
+          <w:color w:val="B9541F"/>
+          <w:sz w:val="17"/>
+          <w:szCs w:val="17"/>
+        </w:rPr>
+        <w:t xml:space="preserve">  →  </w:t>
+      </w:r>
+      <w:hyperlink w:history="1" r:id="rIdxfr3lf_on0kiysyu5sswi">
+        <w:r>
+          <w:rPr>
+            <w:rFonts w:ascii="Arial" w:cs="Arial" w:eastAsia="Arial" w:hAnsi="Arial"/>
+            <w:b/>
+            <w:bCs/>
+            <w:color w:val="1155CC"/>
+            <w:sz w:val="17"/>
+            <w:szCs w:val="17"/>
+            <w:u w:val="single"/>
+          </w:rPr>
+          <w:t xml:space="preserve">READ FULL ARTICLE</w:t>
+        </w:r>
+      </w:hyperlink>
+    </w:p>
+    <w:p>
+      <w:pPr>
+        <w:spacing w:after="80"/>
+      </w:pPr>
+      <w:r>
+        <w:rPr>
+          <w:rFonts w:ascii="Arial" w:cs="Arial" w:eastAsia="Arial" w:hAnsi="Arial"/>
+          <w:color w:val="33291F"/>
+          <w:sz w:val="21"/>
+          <w:szCs w:val="21"/>
+        </w:rPr>
+        <w:t xml:space="preserve">A devotional gathering in Chitrakoot marked the meeting (mangal milan) of Jain munis, centered on a shared message of ahimsa (non-violence) for the community — a reminder of the principle that runs through Jain teaching, delivered as visiting monastic groups crossed paths in the town.</w:t>
+      </w:r>
+    </w:p>
+    <w:p>
+      <w:pPr>
+        <w:pBdr>
+          <w:top w:val="single" w:color="D8CDB4" w:sz="4"/>
+        </w:pBdr>
+        <w:spacing w:after="160"/>
+      </w:pPr>
+    </w:p>
+    <w:p>
+      <w:pPr>
+        <w:spacing w:after="60" w:before="120"/>
+      </w:pPr>
+      <w:r>
+        <w:rPr>
+          <w:rFonts w:ascii="Georgia" w:cs="Georgia" w:eastAsia="Georgia" w:hAnsi="Georgia"/>
+          <w:b/>
+          <w:bCs/>
+          <w:color w:val="1C1712"/>
+          <w:sz w:val="25"/>
+          <w:szCs w:val="25"/>
+        </w:rPr>
+        <w:t xml:space="preserve">Rashtrahit Vichar Goshthi evam Samman Samaroh</w:t>
+      </w:r>
+    </w:p>
+    <w:p>
+      <w:pPr>
+        <w:spacing w:after="40"/>
+      </w:pPr>
+      <w:r>
+        <w:rPr>
+          <w:rFonts w:ascii="Arial" w:cs="Arial" w:eastAsia="Arial" w:hAnsi="Arial"/>
+          <w:b/>
+          <w:bCs/>
+          <w:color w:val="B9541F"/>
+          <w:sz w:val="17"/>
+          <w:szCs w:val="17"/>
+        </w:rPr>
+        <w:t xml:space="preserve">LUCKNOW, UTTAR PRADESH · SOURCE: AMAR BHARTI · AUG 9, 2026</w:t>
+      </w:r>
+      <w:r>
+        <w:rPr>
+          <w:rFonts w:ascii="Arial" w:cs="Arial" w:eastAsia="Arial" w:hAnsi="Arial"/>
+          <w:b/>
+          <w:bCs/>
+          <w:color w:val="B9541F"/>
+          <w:sz w:val="17"/>
+          <w:szCs w:val="17"/>
+        </w:rPr>
+        <w:t xml:space="preserve">  →  </w:t>
+      </w:r>
+      <w:hyperlink w:history="1" r:id="rIdcx_-udnqyga9cl14r1awp">
+        <w:r>
+          <w:rPr>
+            <w:rFonts w:ascii="Arial" w:cs="Arial" w:eastAsia="Arial" w:hAnsi="Arial"/>
+            <w:b/>
+            <w:bCs/>
+            <w:color w:val="1155CC"/>
+            <w:sz w:val="17"/>
+            <w:szCs w:val="17"/>
+            <w:u w:val="single"/>
+          </w:rPr>
+          <w:t xml:space="preserve">READ FULL ARTICLE</w:t>
+        </w:r>
+      </w:hyperlink>
+    </w:p>
+    <w:p>
+      <w:pPr>
+        <w:spacing w:after="80"/>
+      </w:pPr>
+      <w:r>
+        <w:rPr>
+          <w:rFonts w:ascii="Arial" w:cs="Arial" w:eastAsia="Arial" w:hAnsi="Arial"/>
+          <w:color w:val="33291F"/>
+          <w:sz w:val="21"/>
+          <w:szCs w:val="21"/>
+        </w:rPr>
+        <w:t xml:space="preserve">A discussion forum on national interest paired with a felicitation ceremony honoring distinguished Jain community members across professional fields — chartered accountants, doctors, lawyers, professors, engineers, and government officials.</w:t>
+      </w:r>
+    </w:p>
+    <w:p>
+      <w:pPr>
+        <w:pBdr>
+          <w:top w:val="single" w:color="D8CDB4" w:sz="4"/>
+        </w:pBdr>
+        <w:spacing w:after="160"/>
+      </w:pPr>
+    </w:p>
+    <w:p>
+      <w:pPr>
+        <w:spacing w:after="60" w:before="120"/>
+      </w:pPr>
+      <w:r>
+        <w:rPr>
+          <w:rFonts w:ascii="Georgia" w:cs="Georgia" w:eastAsia="Georgia" w:hAnsi="Georgia"/>
+          <w:b/>
+          <w:bCs/>
+          <w:color w:val="1C1712"/>
+          <w:sz w:val="25"/>
+          <w:szCs w:val="25"/>
+        </w:rPr>
         <w:t xml:space="preserve">Young Jains of America Holds 17th Biennial Convention</w:t>
       </w:r>
     </w:p>
@@ -2036,7 +2273,7 @@
         </w:rPr>
         <w:t xml:space="preserve">  →  </w:t>
       </w:r>
-      <w:hyperlink w:history="1" r:id="rIdntuidy1mpgmzrvuqcgfya">
+      <w:hyperlink w:history="1" r:id="rId6unaebkpgseymbb1bkqik">
         <w:r>
           <w:rPr>
             <w:rFonts w:ascii="Arial" w:cs="Arial" w:eastAsia="Arial" w:hAnsi="Arial"/>

</xml_diff>